<commit_message>
Web + web-chung: nen SGV du mon, them tai Excel tung mon (8 cot nhu app), cot 7 dong bo giao an 8/9/2026
Co-Authored-By: Claude Fable 5.1 <noreply@anthropic.com>
Claude-Session: https://claude.ai/code/session_01CH3DVFLNt2eFwxeEQw5xK2
</commit_message>
<xml_diff>
--- a/assets/docs/lop2/Am nhac - Lop 2.docx
+++ b/assets/docs/lop2/Am nhac - Lop 2.docx
@@ -624,6 +624,7 @@
                 <w:i w:val="0"/>
                 <w:sz w:val="18"/>
               </w:rPr>
+              <w:t>NLS: Năng lực số 3.3 CB1a: HS nói được tên bài hát cùng tên tác giả</w:t>
             </w:r>
           </w:p>
         </w:tc>
@@ -740,6 +741,7 @@
                 <w:i w:val="0"/>
                 <w:sz w:val="18"/>
               </w:rPr>
+              <w:t>Năng lực số 1.1 CB1b: HS nêu được đặc điểm nổi bật của “Ước mơ của bạn Đô” nhờ quan sát tư liệu số và nghe bản thu</w:t>
             </w:r>
           </w:p>
         </w:tc>
@@ -856,6 +858,7 @@
                 <w:i w:val="0"/>
                 <w:sz w:val="18"/>
               </w:rPr>
+              <w:t>NLS: Năng lực số 1.1 CB1b: HS đọc đúng cao độ “Bài số 1” nhờ nghe mẫu từ đàn phím</w:t>
             </w:r>
           </w:p>
         </w:tc>
@@ -1088,6 +1091,7 @@
                 <w:i w:val="0"/>
                 <w:sz w:val="18"/>
               </w:rPr>
+              <w:t>NLS: Năng lực số 3.3 CB1a: HS nói được tên bài hát cùng tên tác giả</w:t>
             </w:r>
           </w:p>
         </w:tc>
@@ -1204,6 +1208,7 @@
                 <w:i w:val="0"/>
                 <w:sz w:val="18"/>
               </w:rPr>
+              <w:t>Năng lực số 1.1 CB1b: HS cầm và gõ được nhạc cụ Song loan đúng cách sau khi xem phim cận cảnh</w:t>
             </w:r>
           </w:p>
         </w:tc>
@@ -1320,7 +1325,7 @@
                 <w:i w:val="0"/>
                 <w:sz w:val="18"/>
               </w:rPr>
-              <w:t>QPAN: Chọn bài hát ca ngợi quê hương, đất nước, hoà bình; liên hệ tinh thần đoàn kết toàn dân tộc và sự hi sinh của các chiến sĩ cách mạng.</w:t>
+              <w:t>Năng lực số 1.1 CB1b: HS nêu được đặc điểm nổi bật của “Đàn bầu Việt Nam” nhờ quan sát tư liệu số và nghe bản thu</w:t>
             </w:r>
           </w:p>
           <w:p>
@@ -1333,7 +1338,7 @@
                 <w:i w:val="0"/>
                 <w:sz w:val="18"/>
               </w:rPr>
-              <w:t>KNS: KN tự tin biểu diễn trước tập thể và phối hợp cùng nhóm.</w:t>
+              <w:t>QPAN: Chọn bài hát ca ngợi quê hương, đất nước, hoà bình; liên hệ tinh thần đoàn kết toàn dân tộc và sự hi sinh của các chiến sĩ cách mạng.</w:t>
             </w:r>
           </w:p>
         </w:tc>
@@ -1567,6 +1572,7 @@
                 <w:i w:val="0"/>
                 <w:sz w:val="18"/>
               </w:rPr>
+              <w:t>Năng lực số 1.1 CB1b: HS đọc đúng cao độ “đọc nhạc theo kí hiệu bàn tay” nhờ nghe mẫu từ đàn phím</w:t>
             </w:r>
           </w:p>
         </w:tc>
@@ -1683,6 +1689,7 @@
                 <w:i w:val="0"/>
                 <w:sz w:val="18"/>
               </w:rPr>
+              <w:t>Năng lực số 1.1 CB1b: HS đọc đúng cao độ “đọc nhạc theo kí hiệu bàn tay” nhờ nghe mẫu từ đàn phím</w:t>
             </w:r>
           </w:p>
         </w:tc>
@@ -1799,6 +1806,7 @@
                 <w:i w:val="0"/>
                 <w:sz w:val="18"/>
               </w:rPr>
+              <w:t>NLS: Năng lực số 1.1 CB1b: HS đọc đúng cao độ “Bài số 2” nhờ nghe mẫu từ đàn phím</w:t>
             </w:r>
           </w:p>
         </w:tc>
@@ -2031,6 +2039,7 @@
                 <w:i w:val="0"/>
                 <w:sz w:val="18"/>
               </w:rPr>
+              <w:t>NLS: Năng lực số 3.3 CB1a: HS nói được tên bài hát cùng tên tác giả</w:t>
             </w:r>
           </w:p>
         </w:tc>
@@ -2147,6 +2156,7 @@
                 <w:i w:val="0"/>
                 <w:sz w:val="18"/>
               </w:rPr>
+              <w:t>NLS: Năng lực số 3.3 CB1a: HS nói được tên tác phẩm và tên tác giả có ghi trong phần chú thích</w:t>
             </w:r>
           </w:p>
         </w:tc>
@@ -2752,6 +2762,7 @@
                 <w:i w:val="0"/>
                 <w:sz w:val="18"/>
               </w:rPr>
+              <w:t>NLS: Năng lực số 3.3 CB1a: HS nói được tên bài hát cùng tên tác giả</w:t>
             </w:r>
           </w:p>
         </w:tc>
@@ -2868,6 +2879,7 @@
                 <w:i w:val="0"/>
                 <w:sz w:val="18"/>
               </w:rPr>
+              <w:t>NLS: Năng lực số 1.1 CB1b: HS đọc đúng cao độ “Bài số 3” nhờ nghe mẫu từ đàn phím</w:t>
             </w:r>
           </w:p>
         </w:tc>
@@ -2984,6 +2996,7 @@
                 <w:i w:val="0"/>
                 <w:sz w:val="18"/>
               </w:rPr>
+              <w:t>Năng lực số 1.1 CB1b: HS nêu được đặc điểm nổi bật của “Câu chuyện về bài hát Chú voi con ở Bản Đôn” nhờ quan sát tư liệu số và nghe bản thu</w:t>
             </w:r>
           </w:p>
         </w:tc>
@@ -3216,6 +3229,7 @@
                 <w:i w:val="0"/>
                 <w:sz w:val="18"/>
               </w:rPr>
+              <w:t>NLS: Năng lực số 3.3 CB1a: HS nói được tên bài hát cùng tên tác giả</w:t>
             </w:r>
           </w:p>
         </w:tc>
@@ -3332,6 +3346,7 @@
                 <w:i w:val="0"/>
                 <w:sz w:val="18"/>
               </w:rPr>
+              <w:t>NLS: Năng lực số 3.3 CB1a: HS nói được tên tác phẩm và tên tác giả có ghi trong phần chú thích</w:t>
             </w:r>
           </w:p>
         </w:tc>
@@ -3442,6 +3457,19 @@
               <w:spacing w:after="0"/>
             </w:pPr>
             <w:r/>
+            <w:r>
+              <w:rPr>
+                <w:b w:val="0"/>
+                <w:i w:val="0"/>
+                <w:sz w:val="18"/>
+              </w:rPr>
+              <w:t>Năng lực số 1.1 CB1b: HS nêu được đặc điểm nổi bật của “Giới thiệu nhạc cụ Ma-ra-cát” nhờ quan sát tư liệu số và nghe bản thu</w:t>
+            </w:r>
+          </w:p>
+          <w:p>
+            <w:pPr>
+              <w:spacing w:after="0"/>
+            </w:pPr>
             <w:r>
               <w:rPr>
                 <w:b w:val="0"/>
@@ -3682,6 +3710,7 @@
                 <w:i w:val="0"/>
                 <w:sz w:val="18"/>
               </w:rPr>
+              <w:t>NLS: Năng lực số 3.3 CB1a: HS nói được tên bài hát cùng tên tác giả</w:t>
             </w:r>
           </w:p>
         </w:tc>
@@ -3798,6 +3827,7 @@
                 <w:i w:val="0"/>
                 <w:sz w:val="18"/>
               </w:rPr>
+              <w:t>NLS: Năng lực số 1.1 CB1b: HS đọc đúng cao độ “Bài số 4” nhờ nghe mẫu từ đàn phím</w:t>
             </w:r>
           </w:p>
         </w:tc>
@@ -3914,6 +3944,7 @@
                 <w:i w:val="0"/>
                 <w:sz w:val="18"/>
               </w:rPr>
+              <w:t>NLS: Năng lực số 3.3 CB1a: HS nói được tên tác phẩm và tên tác giả có ghi trong phần chú thích</w:t>
             </w:r>
           </w:p>
         </w:tc>
@@ -4146,6 +4177,7 @@
                 <w:i w:val="0"/>
                 <w:sz w:val="18"/>
               </w:rPr>
+              <w:t>NLS: Năng lực số 3.3 CB1a: HS nói được tên bài hát cùng tên tác giả</w:t>
             </w:r>
           </w:p>
         </w:tc>
@@ -4378,6 +4410,7 @@
                 <w:i w:val="0"/>
                 <w:sz w:val="18"/>
               </w:rPr>
+              <w:t>NLS: Năng lực số 3.3 CB1a: HS nói được tên tác phẩm và tên tác giả có ghi trong phần chú thích</w:t>
             </w:r>
           </w:p>
         </w:tc>
@@ -4610,6 +4643,7 @@
                 <w:i w:val="0"/>
                 <w:sz w:val="18"/>
               </w:rPr>
+              <w:t>Năng lực số 3.3 CB1a: HS trả lời đúng bộ câu hỏi ôn tập và gọi được tên bài hát, tên tác giả đã học</w:t>
             </w:r>
           </w:p>
         </w:tc>

</xml_diff>